<commit_message>
cambio variable voto y modelamiento
</commit_message>
<xml_diff>
--- a/output/Descriptivos/tabla_consolidada.docx
+++ b/output/Descriptivos/tabla_consolidada.docx
@@ -81,37 +81,37 @@
               <w:pStyle w:val="Normal"/>
             </w:pPr>
             <w:r>
-              <w:t>37.7% (35.5%–40.0%)</w:t>
-            </w:r>
-          </w:p>
-        </w:tc>
-        <w:tc>
-          <w:p>
-            <w:pPr>
-              <w:pStyle w:val="Normal"/>
-            </w:pPr>
-            <w:r>
-              <w:t>31.8% (29.8%–33.8%)</w:t>
-            </w:r>
-          </w:p>
-        </w:tc>
-        <w:tc>
-          <w:p>
-            <w:pPr>
-              <w:pStyle w:val="Normal"/>
-            </w:pPr>
-            <w:r>
-              <w:t>33.1% (31.1%–35.2%)</w:t>
-            </w:r>
-          </w:p>
-        </w:tc>
-        <w:tc>
-          <w:p>
-            <w:pPr>
-              <w:pStyle w:val="Normal"/>
-            </w:pPr>
-            <w:r>
-              <w:t>31.2% (25.2%–37.7%)</w:t>
+              <w:t>77.6% (75.8%–79.4%)</w:t>
+            </w:r>
+          </w:p>
+        </w:tc>
+        <w:tc>
+          <w:p>
+            <w:pPr>
+              <w:pStyle w:val="Normal"/>
+            </w:pPr>
+            <w:r>
+              <w:t>65.6% (63.3%–67.8%)</w:t>
+            </w:r>
+          </w:p>
+        </w:tc>
+        <w:tc>
+          <w:p>
+            <w:pPr>
+              <w:pStyle w:val="Normal"/>
+            </w:pPr>
+            <w:r>
+              <w:t>71.0% (69.1%–72.9%)</w:t>
+            </w:r>
+          </w:p>
+        </w:tc>
+        <w:tc>
+          <w:p>
+            <w:pPr>
+              <w:pStyle w:val="Normal"/>
+            </w:pPr>
+            <w:r>
+              <w:t>81.5% (77.8%–84.9%)</w:t>
             </w:r>
           </w:p>
         </w:tc>

</xml_diff>